<commit_message>
feat: Mitteilung als Sandwich + 1. Abmahnung als BV-Beilage
Mitteilungs-Vorlage: Plakette-/Neupächter-Absatz direkt nach der
Einleitung (Positives zuerst), danach UPV-Erläuterung + Frist-Zeile.
BV-Entwurf (2. Abmahnung): liegt die 1. Abmahnung des Vereins in der
Dokumenten-Akte (typ schreiben, "Abmahnung" in der Notiz), geht sie zur
Kenntnis als Anhang mit (+ Satz im Anschreiben). K35/S18 gerendert und
Reihenfolge verifiziert, Smoke 8/8+9/9.

Co-Authored-By: Claude Fable 5 <noreply@anthropic.com>
</commit_message>
<xml_diff>
--- a/vorlagen/mitteilung.docx
+++ b/vorlagen/mitteilung.docx
@@ -239,42 +239,6 @@
     </w:p>
     <w:p>
       <w:pPr>
-        <w:spacing w:after="0" w:before="0"/>
-      </w:pPr>
-      <w:r>
-        <w:rPr>
-          <w:b w:val="0"/>
-          <w:i w:val="0"/>
-        </w:rPr>
-        <w:t>{% if erlaeuterung %}</w:t>
-      </w:r>
-    </w:p>
-    <w:p>
-      <w:pPr>
-        <w:spacing w:after="200" w:before="0"/>
-      </w:pPr>
-      <w:r>
-        <w:rPr>
-          <w:b w:val="0"/>
-          <w:i w:val="0"/>
-        </w:rPr>
-        <w:t>Mit der Unterzeichnung des Unterpachtvertrages {% if anrede_form == 'Du' %}hast Du Dich{% else %}haben Sie sich{% endif %} zur Einhaltung der Gartenordnung verpflichtet, die die kleingärtnerische Nutzung der Parzelle näher regelt.</w:t>
-      </w:r>
-    </w:p>
-    <w:p>
-      <w:pPr>
-        <w:spacing w:after="0" w:before="0"/>
-      </w:pPr>
-      <w:r>
-        <w:rPr>
-          <w:b w:val="0"/>
-          <w:i w:val="0"/>
-        </w:rPr>
-        <w:t>{% endif %}</w:t>
-      </w:r>
-    </w:p>
-    <w:p>
-      <w:pPr>
         <w:spacing w:after="160" w:before="0"/>
       </w:pPr>
       <w:r>
@@ -343,6 +307,42 @@
           <w:i w:val="0"/>
         </w:rPr>
         <w:t>{%p endif %}</w:t>
+      </w:r>
+    </w:p>
+    <w:p>
+      <w:pPr>
+        <w:spacing w:after="0" w:before="0"/>
+      </w:pPr>
+      <w:r>
+        <w:rPr>
+          <w:b w:val="0"/>
+          <w:i w:val="0"/>
+        </w:rPr>
+        <w:t>{% if erlaeuterung %}</w:t>
+      </w:r>
+    </w:p>
+    <w:p>
+      <w:pPr>
+        <w:spacing w:after="200" w:before="0"/>
+      </w:pPr>
+      <w:r>
+        <w:rPr>
+          <w:b w:val="0"/>
+          <w:i w:val="0"/>
+        </w:rPr>
+        <w:t>Mit der Unterzeichnung des Unterpachtvertrages {% if anrede_form == 'Du' %}hast Du Dich{% else %}haben Sie sich{% endif %} zur Einhaltung der Gartenordnung verpflichtet, die die kleingärtnerische Nutzung der Parzelle näher regelt.</w:t>
+      </w:r>
+    </w:p>
+    <w:p>
+      <w:pPr>
+        <w:spacing w:after="0" w:before="0"/>
+      </w:pPr>
+      <w:r>
+        <w:rPr>
+          <w:b w:val="0"/>
+          <w:i w:val="0"/>
+        </w:rPr>
+        <w:t>{% endif %}</w:t>
       </w:r>
     </w:p>
     <w:p>

</xml_diff>